<commit_message>
Update deployment report with HTTPS, WebRTC camera, auth fix, and URL migration
</commit_message>
<xml_diff>
--- a/Informe_Despliegue_Intercagram_Azure.docx
+++ b/Informe_Despliegue_Intercagram_Azure.docx
@@ -510,7 +510,15 @@
         <w:pStyle w:val="ListBullet"/>
       </w:pPr>
       <w:r>
-        <w:t>Puerto 80 (HTTP): abierto al público para la aplicación web</w:t>
+        <w:t>Puerto 80 (HTTP): redirige a HTTPS</w:t>
+      </w:r>
+    </w:p>
+    <w:p>
+      <w:pPr>
+        <w:pStyle w:val="ListBullet"/>
+      </w:pPr>
+      <w:r>
+        <w:t>Puerto 443 (HTTPS): abierto al público para la aplicación web con SSL</w:t>
       </w:r>
     </w:p>
     <w:p>
@@ -519,6 +527,38 @@
       </w:pPr>
       <w:r>
         <w:t>Puerto 3306 (MySQL): cerrado (solo acceso local desde la VM)</w:t>
+      </w:r>
+    </w:p>
+    <w:p>
+      <w:pPr>
+        <w:pStyle w:val="Heading2"/>
+      </w:pPr>
+      <w:r>
+        <w:t>3.3 Configuración de HTTPS</w:t>
+      </w:r>
+    </w:p>
+    <w:p>
+      <w:r>
+        <w:t>Se generó un certificado SSL autofirmado y se configuró Apache para servir la aplicación exclusivamente sobre HTTPS en el puerto 443:</w:t>
+      </w:r>
+    </w:p>
+    <w:p>
+      <w:pPr>
+        <w:pStyle w:val="Quote"/>
+      </w:pPr>
+      <w:r>
+        <w:t>sudo openssl req -x509 -nodes -days 365 -newkey rsa:2048 \</w:t>
+        <w:br/>
+        <w:t>-keyout /etc/ssl/private/intercagram.key \</w:t>
+        <w:br/>
+        <w:t>-out /etc/ssl/certs/intercagram.crt \</w:t>
+        <w:br/>
+        <w:t>-subj '/CN=20.151.96.66'</w:t>
+      </w:r>
+    </w:p>
+    <w:p>
+      <w:r>
+        <w:t>Se creó el VirtualHost intercagram-ssl.conf en Apache con SSLEngine on, apuntando a /var/www/html/intercagram/public como DocumentRoot. El tráfico HTTP (puerto 80) se redirige automáticamente a HTTPS mediante Redirect permanent.</w:t>
       </w:r>
     </w:p>
     <w:p>
@@ -717,6 +757,251 @@
     </w:p>
     <w:p>
       <w:pPr>
+        <w:pStyle w:val="Heading2"/>
+      </w:pPr>
+      <w:r>
+        <w:t>4.6 Configuración de HTTPS en Apache</w:t>
+      </w:r>
+    </w:p>
+    <w:p>
+      <w:r>
+        <w:t>Se implementó HTTPS en la aplicación mediante un certificado SSL autofirmado:</w:t>
+      </w:r>
+    </w:p>
+    <w:p>
+      <w:pPr>
+        <w:pStyle w:val="ListBullet"/>
+      </w:pPr>
+      <w:r>
+        <w:t>Generación de certificado SSL autofirmado con OpenSSL (RSA 2048, validez 365 días)</w:t>
+      </w:r>
+    </w:p>
+    <w:p>
+      <w:pPr>
+        <w:pStyle w:val="ListBullet"/>
+      </w:pPr>
+      <w:r>
+        <w:t>Creación del VirtualHost intercagram-ssl.conf en Apache con SSLEngine on</w:t>
+      </w:r>
+    </w:p>
+    <w:p>
+      <w:pPr>
+        <w:pStyle w:val="ListBullet"/>
+      </w:pPr>
+      <w:r>
+        <w:t>Configuración del DocumentRoot en /var/www/html/intercagram/public</w:t>
+      </w:r>
+    </w:p>
+    <w:p>
+      <w:pPr>
+        <w:pStyle w:val="ListBullet"/>
+      </w:pPr>
+      <w:r>
+        <w:t>Apertura del puerto 443 en el NSG de Azure</w:t>
+      </w:r>
+    </w:p>
+    <w:p>
+      <w:pPr>
+        <w:pStyle w:val="ListBullet"/>
+      </w:pPr>
+      <w:r>
+        <w:t>Redirección automática de HTTP a HTTPS mediante Redirect permanent</w:t>
+      </w:r>
+    </w:p>
+    <w:p>
+      <w:pPr>
+        <w:pStyle w:val="ListBullet"/>
+      </w:pPr>
+      <w:r>
+        <w:t>Actualización de APP_URL en .env del backend a https://20.151.96.66</w:t>
+      </w:r>
+    </w:p>
+    <w:p>
+      <w:pPr>
+        <w:pStyle w:val="Heading2"/>
+      </w:pPr>
+      <w:r>
+        <w:t>4.7 Implementación de Cámara WebRTC</w:t>
+      </w:r>
+    </w:p>
+    <w:p>
+      <w:r>
+        <w:t>Se implementó la captura de fotos directamente desde la cámara del dispositivo utilizando la API WebRTC (getUserMedia), reemplazando el &lt;input capture='environment'&gt; que solo funcionaba en dispositivos móviles:</w:t>
+      </w:r>
+    </w:p>
+    <w:p>
+      <w:pPr>
+        <w:pStyle w:val="ListBullet"/>
+      </w:pPr>
+      <w:r>
+        <w:t>Creación de vista previa en vivo (video tag) con stream de getUserMedia</w:t>
+      </w:r>
+    </w:p>
+    <w:p>
+      <w:pPr>
+        <w:pStyle w:val="ListBullet"/>
+      </w:pPr>
+      <w:r>
+        <w:t>Botón de captura que toma una foto del video y la dibuja en un canvas</w:t>
+      </w:r>
+    </w:p>
+    <w:p>
+      <w:pPr>
+        <w:pStyle w:val="ListBullet"/>
+      </w:pPr>
+      <w:r>
+        <w:t>Botón de volteo de cámara (facingMode: 'user' ↔ 'environment') para cámara frontal/posterior</w:t>
+      </w:r>
+    </w:p>
+    <w:p>
+      <w:pPr>
+        <w:pStyle w:val="ListBullet"/>
+      </w:pPr>
+      <w:r>
+        <w:t>Efecto espejo en la vista previa de la cámara frontal mediante transform: scaleX(-1)</w:t>
+      </w:r>
+    </w:p>
+    <w:p>
+      <w:pPr>
+        <w:pStyle w:val="ListBullet"/>
+      </w:pPr>
+      <w:r>
+        <w:t>Opción alternativa 'Elegir archivo' con &lt;input type='file'&gt; para subir imágenes existentes</w:t>
+      </w:r>
+    </w:p>
+    <w:p>
+      <w:pPr>
+        <w:pStyle w:val="ListBullet"/>
+      </w:pPr>
+      <w:r>
+        <w:t>Guardia de doble clic: bandera uploading que deshabilita el botón y muestra 'Publicando...'</w:t>
+      </w:r>
+    </w:p>
+    <w:p>
+      <w:pPr>
+        <w:pStyle w:val="ListBullet"/>
+      </w:pPr>
+      <w:r>
+        <w:t>Toast de confirmación verde al crear publicación ('Publicación creada', 1.5 segundos)</w:t>
+      </w:r>
+    </w:p>
+    <w:p>
+      <w:pPr>
+        <w:pStyle w:val="ListBullet"/>
+      </w:pPr>
+      <w:r>
+        <w:t>Navegación automática al feed tras publicación exitosa</w:t>
+      </w:r>
+    </w:p>
+    <w:p>
+      <w:pPr>
+        <w:pStyle w:val="Heading2"/>
+      </w:pPr>
+      <w:r>
+        <w:t>4.8 Corrección de Error 500 en Autenticación</w:t>
+      </w:r>
+    </w:p>
+    <w:p>
+      <w:r>
+        <w:t>Se solucionó un error crítico que causaba una respuesta HTTP 500 en lugar de 401 cuando un usuario no autenticado intentaba acceder a rutas protegidas de la API:</w:t>
+      </w:r>
+    </w:p>
+    <w:p>
+      <w:r>
+        <w:t>La causa era que Laravel intentaba redirigir a una ruta llamada 'login' (propia de aplicaciones web con sesiones), inexistente en una API stateless. Se agregó un callback en bootstrap/app.php que retorna null para rutas API, permitiendo que la excepción AuthenticationException se maneje correctamente con un response JSON 401:</w:t>
+      </w:r>
+    </w:p>
+    <w:p>
+      <w:pPr>
+        <w:pStyle w:val="Quote"/>
+      </w:pPr>
+      <w:r>
+        <w:t>-&gt;withRouting(</w:t>
+        <w:br/>
+        <w:t xml:space="preserve">    api: __DIR__.'/../routes/api.php',</w:t>
+        <w:br/>
+        <w:t xml:space="preserve">    then: function () {</w:t>
+        <w:br/>
+        <w:t xml:space="preserve">        RedirectIfAuthenticated::redirectUsing(fn () =&gt; null);</w:t>
+        <w:br/>
+        <w:t xml:space="preserve">    },</w:t>
+        <w:br/>
+        <w:t>)</w:t>
+      </w:r>
+    </w:p>
+    <w:p>
+      <w:r>
+        <w:t>Además se agregó un renderizador personalizado para AuthenticationException que retorna status 401 con mensaje 'Unauthenticated' en formato JSON.</w:t>
+      </w:r>
+    </w:p>
+    <w:p>
+      <w:pPr>
+        <w:pStyle w:val="Heading2"/>
+      </w:pPr>
+      <w:r>
+        <w:t>4.9 Migración de URLs de HTTP a HTTPS</w:t>
+      </w:r>
+    </w:p>
+    <w:p>
+      <w:r>
+        <w:t>Todas las URLs del frontend Ionic/Angular se actualizaron de HTTP a HTTPS para evitar errores de contenido mixto (Mixed Content) y permitir el acceso a la cámara (getUserMedia requiere contexto seguro - HTTPS):</w:t>
+      </w:r>
+    </w:p>
+    <w:p>
+      <w:pPr>
+        <w:pStyle w:val="ListBullet"/>
+      </w:pPr>
+      <w:r>
+        <w:t>api.ts: baseURL cambiado de http://20.151.96.66/api/ a https://20.151.96.66/api/</w:t>
+      </w:r>
+    </w:p>
+    <w:p>
+      <w:pPr>
+        <w:pStyle w:val="ListBullet"/>
+      </w:pPr>
+      <w:r>
+        <w:t>auth.ts: URL de autenticación actualizada a https://20.151.96.66/api/</w:t>
+      </w:r>
+    </w:p>
+    <w:p>
+      <w:pPr>
+        <w:pStyle w:val="ListBullet"/>
+      </w:pPr>
+      <w:r>
+        <w:t>feed.page.ts: imageBaseUrl cambiado a https://20.151.96.66/storage/</w:t>
+      </w:r>
+    </w:p>
+    <w:p>
+      <w:pPr>
+        <w:pStyle w:val="ListBullet"/>
+      </w:pPr>
+      <w:r>
+        <w:t>friends.page.ts: imageBaseUrl cambiado a https://20.151.96.66/storage/</w:t>
+      </w:r>
+    </w:p>
+    <w:p>
+      <w:pPr>
+        <w:pStyle w:val="ListBullet"/>
+      </w:pPr>
+      <w:r>
+        <w:t>.env del backend: APP_URL actualizado a https://20.151.96.66</w:t>
+      </w:r>
+    </w:p>
+    <w:p>
+      <w:pPr>
+        <w:pStyle w:val="Heading2"/>
+      </w:pPr>
+      <w:r>
+        <w:t>4.10 Limpieza de Publicaciones Duplicadas</w:t>
+      </w:r>
+    </w:p>
+    <w:p>
+      <w:r>
+        <w:t>Se identificaron y eliminaron 4 publicaciones duplicadas (IDs 13-16) en la base de datos MySQL, que fueron generadas durante pruebas de la funcionalidad de cámara y carga de imágenes.</w:t>
+      </w:r>
+    </w:p>
+    <w:p>
+      <w:pPr>
         <w:pStyle w:val="Heading1"/>
       </w:pPr>
       <w:r>
@@ -725,7 +1010,7 @@
     </w:p>
     <w:p>
       <w:r>
-        <w:t>La API REST expone los siguientes endpoints, todos accesibles desde http://20.151.96.66/api/:</w:t>
+        <w:t>La API REST expone los siguientes endpoints, todos accesibles desde https://20.151.96.66/api/:</w:t>
       </w:r>
     </w:p>
     <w:p>
@@ -1506,7 +1791,7 @@
           </w:tcPr>
           <w:p>
             <w:r>
-              <w:t>Frontend Ionic carga correctamente</w:t>
+              <w:t>Frontend Ionic carga correctamente sobre HTTPS</w:t>
             </w:r>
           </w:p>
         </w:tc>
@@ -1551,6 +1836,204 @@
           <w:p>
             <w:r>
               <w:t>Imágenes se sirven correctamente</w:t>
+            </w:r>
+          </w:p>
+        </w:tc>
+      </w:tr>
+      <w:tr>
+        <w:tc>
+          <w:tcPr>
+            <w:tcW w:type="dxa" w:w="4320"/>
+          </w:tcPr>
+          <w:p>
+            <w:r>
+              <w:t>GET https://20.151.96.66/api/me (sin token)</w:t>
+            </w:r>
+          </w:p>
+        </w:tc>
+        <w:tc>
+          <w:tcPr>
+            <w:tcW w:type="dxa" w:w="4320"/>
+          </w:tcPr>
+          <w:p>
+            <w:r>
+              <w:t>401 Unauthenticated (JSON)</w:t>
+            </w:r>
+          </w:p>
+        </w:tc>
+      </w:tr>
+      <w:tr>
+        <w:tc>
+          <w:tcPr>
+            <w:tcW w:type="dxa" w:w="4320"/>
+          </w:tcPr>
+          <w:p>
+            <w:r>
+              <w:t>GET https://20.151.96.66/api/me (con token)</w:t>
+            </w:r>
+          </w:p>
+        </w:tc>
+        <w:tc>
+          <w:tcPr>
+            <w:tcW w:type="dxa" w:w="4320"/>
+          </w:tcPr>
+          <w:p>
+            <w:r>
+              <w:t>200 OK, datos del usuario</w:t>
+            </w:r>
+          </w:p>
+        </w:tc>
+      </w:tr>
+      <w:tr>
+        <w:tc>
+          <w:tcPr>
+            <w:tcW w:type="dxa" w:w="4320"/>
+          </w:tcPr>
+          <w:p>
+            <w:r>
+              <w:t>GET https://20.151.96.66/api/posts</w:t>
+            </w:r>
+          </w:p>
+        </w:tc>
+        <w:tc>
+          <w:tcPr>
+            <w:tcW w:type="dxa" w:w="4320"/>
+          </w:tcPr>
+          <w:p>
+            <w:r>
+              <w:t>200 OK, feed de publicaciones</w:t>
+            </w:r>
+          </w:p>
+        </w:tc>
+      </w:tr>
+      <w:tr>
+        <w:tc>
+          <w:tcPr>
+            <w:tcW w:type="dxa" w:w="4320"/>
+          </w:tcPr>
+          <w:p>
+            <w:r>
+              <w:t>POST https://20.151.96.66/api/posts</w:t>
+            </w:r>
+          </w:p>
+        </w:tc>
+        <w:tc>
+          <w:tcPr>
+            <w:tcW w:type="dxa" w:w="4320"/>
+          </w:tcPr>
+          <w:p>
+            <w:r>
+              <w:t>201 Created con imagen</w:t>
+            </w:r>
+          </w:p>
+        </w:tc>
+      </w:tr>
+      <w:tr>
+        <w:tc>
+          <w:tcPr>
+            <w:tcW w:type="dxa" w:w="4320"/>
+          </w:tcPr>
+          <w:p>
+            <w:r>
+              <w:t>GET https://20.151.96.66/api/friends</w:t>
+            </w:r>
+          </w:p>
+        </w:tc>
+        <w:tc>
+          <w:tcPr>
+            <w:tcW w:type="dxa" w:w="4320"/>
+          </w:tcPr>
+          <w:p>
+            <w:r>
+              <w:t>200 OK, lista de amigos</w:t>
+            </w:r>
+          </w:p>
+        </w:tc>
+      </w:tr>
+      <w:tr>
+        <w:tc>
+          <w:tcPr>
+            <w:tcW w:type="dxa" w:w="4320"/>
+          </w:tcPr>
+          <w:p>
+            <w:r>
+              <w:t>Cámara WebRTC (getUserMedia)</w:t>
+            </w:r>
+          </w:p>
+        </w:tc>
+        <w:tc>
+          <w:tcPr>
+            <w:tcW w:type="dxa" w:w="4320"/>
+          </w:tcPr>
+          <w:p>
+            <w:r>
+              <w:t>Stream de video en vivo, captura y carga</w:t>
+            </w:r>
+          </w:p>
+        </w:tc>
+      </w:tr>
+      <w:tr>
+        <w:tc>
+          <w:tcPr>
+            <w:tcW w:type="dxa" w:w="4320"/>
+          </w:tcPr>
+          <w:p>
+            <w:r>
+              <w:t>Doble clic en Publicar</w:t>
+            </w:r>
+          </w:p>
+        </w:tc>
+        <w:tc>
+          <w:tcPr>
+            <w:tcW w:type="dxa" w:w="4320"/>
+          </w:tcPr>
+          <w:p>
+            <w:r>
+              <w:t>Segundo clic bloqueado, muestra "Publicando..."</w:t>
+            </w:r>
+          </w:p>
+        </w:tc>
+      </w:tr>
+      <w:tr>
+        <w:tc>
+          <w:tcPr>
+            <w:tcW w:type="dxa" w:w="4320"/>
+          </w:tcPr>
+          <w:p>
+            <w:r>
+              <w:t>Toast de confirmación</w:t>
+            </w:r>
+          </w:p>
+        </w:tc>
+        <w:tc>
+          <w:tcPr>
+            <w:tcW w:type="dxa" w:w="4320"/>
+          </w:tcPr>
+          <w:p>
+            <w:r>
+              <w:t>Mensaje verde "Publicación creada" 1.5s, navega a /feed</w:t>
+            </w:r>
+          </w:p>
+        </w:tc>
+      </w:tr>
+      <w:tr>
+        <w:tc>
+          <w:tcPr>
+            <w:tcW w:type="dxa" w:w="4320"/>
+          </w:tcPr>
+          <w:p>
+            <w:r>
+              <w:t>Redirección HTTP→HTTPS</w:t>
+            </w:r>
+          </w:p>
+        </w:tc>
+        <w:tc>
+          <w:tcPr>
+            <w:tcW w:type="dxa" w:w="4320"/>
+          </w:tcPr>
+          <w:p>
+            <w:r>
+              <w:t>http://20.151.96.66 redirige a https://20.151.96.66</w:t>
             </w:r>
           </w:p>
         </w:tc>
@@ -1621,6 +2104,21 @@
         <w:t>5. La aplicación es funcional al 100%: registro, login, publicaciones con imágenes, likes, comentarios y gestión de amistades.</w:t>
       </w:r>
     </w:p>
+    <w:p>
+      <w:r>
+        <w:t>6. Se implementó HTTPS con certificado SSL autofirmado, garantizando comunicación cifrada entre el cliente y el servidor. Esto permitió habilitar la API getUserMedia para acceso a la cámara desde el navegador.</w:t>
+      </w:r>
+    </w:p>
+    <w:p>
+      <w:r>
+        <w:t>7. La cámara WebRTC funciona correctamente en dispositivos móviles y de escritorio, con soporte para cámara frontal y posterior, vista previa en vivo, y guardia de doble clic para evitar publicaciones duplicadas.</w:t>
+      </w:r>
+    </w:p>
+    <w:p>
+      <w:r>
+        <w:t>8. Se corrigió el error de autenticación que retornaba HTTP 500 en lugar de 401, implementando el manejo correcto de AuthenticationException para APIs stateless.</w:t>
+      </w:r>
+    </w:p>
     <w:p/>
     <w:p>
       <w:pPr>
@@ -1632,12 +2130,17 @@
     </w:p>
     <w:p>
       <w:r>
-        <w:t>Frontend Web: http://20.151.96.66/app/</w:t>
+        <w:t>Frontend Web: https://20.151.96.66/app/</w:t>
       </w:r>
     </w:p>
     <w:p>
       <w:r>
-        <w:t>API Root: http://20.151.96.66/api/</w:t>
+        <w:t>API Root: https://20.151.96.66/api/</w:t>
+      </w:r>
+    </w:p>
+    <w:p>
+      <w:r>
+        <w:t>Nota: HTTP (puerto 80) redirige automáticamente a HTTPS (puerto 443).</w:t>
       </w:r>
     </w:p>
     <w:p>

</xml_diff>